<commit_message>
Update investor content for 2026-07-24
</commit_message>
<xml_diff>
--- a/public/investor-downloads/daily-brief-2026-07-24.docx
+++ b/public/investor-downloads/daily-brief-2026-07-24.docx
@@ -8,7 +8,7 @@
       </w:pPr>
       <w:r>
         <w:rPr>
-          <w:rFonts w:ascii="Calibri" w:hAnsi="Calibri" w:eastAsia="Heiti TC"/>
+          <w:rFonts w:ascii="Calibri" w:hAnsi="Calibri" w:eastAsia="Arial Unicode MS"/>
           <w:b/>
           <w:i w:val="0"/>
           <w:color w:val="285B9D"/>
@@ -24,7 +24,7 @@
       </w:pPr>
       <w:r>
         <w:rPr>
-          <w:rFonts w:ascii="Calibri" w:hAnsi="Calibri" w:eastAsia="Heiti TC"/>
+          <w:rFonts w:ascii="Calibri" w:hAnsi="Calibri" w:eastAsia="Arial Unicode MS"/>
           <w:b w:val="0"/>
           <w:i w:val="0"/>
         </w:rPr>
@@ -38,7 +38,7 @@
       </w:pPr>
       <w:r>
         <w:rPr>
-          <w:rFonts w:ascii="Calibri" w:hAnsi="Calibri" w:eastAsia="Heiti TC"/>
+          <w:rFonts w:ascii="Calibri" w:hAnsi="Calibri" w:eastAsia="Arial Unicode MS"/>
           <w:b w:val="0"/>
           <w:i w:val="0"/>
         </w:rPr>
@@ -51,7 +51,7 @@
       </w:pPr>
       <w:r>
         <w:rPr>
-          <w:rFonts w:ascii="Calibri" w:hAnsi="Calibri" w:eastAsia="Heiti TC"/>
+          <w:rFonts w:ascii="Calibri" w:hAnsi="Calibri" w:eastAsia="Arial Unicode MS"/>
           <w:b/>
           <w:i w:val="0"/>
           <w:color w:val="0B2545"/>
@@ -66,7 +66,7 @@
       </w:pPr>
       <w:r>
         <w:rPr>
-          <w:rFonts w:ascii="Calibri" w:hAnsi="Calibri" w:eastAsia="Heiti TC"/>
+          <w:rFonts w:ascii="Calibri" w:hAnsi="Calibri" w:eastAsia="Arial Unicode MS"/>
           <w:b w:val="0"/>
           <w:i w:val="0"/>
           <w:color w:val="334155"/>
@@ -101,7 +101,7 @@
             </w:pPr>
             <w:r>
               <w:rPr>
-                <w:rFonts w:ascii="Calibri" w:hAnsi="Calibri" w:eastAsia="Heiti TC"/>
+                <w:rFonts w:ascii="Calibri" w:hAnsi="Calibri" w:eastAsia="Arial Unicode MS"/>
                 <w:b/>
                 <w:color w:val="667085"/>
                 <w:sz w:val="17"/>
@@ -111,7 +111,7 @@
             </w:r>
             <w:r>
               <w:rPr>
-                <w:rFonts w:ascii="Calibri" w:hAnsi="Calibri" w:eastAsia="Heiti TC"/>
+                <w:rFonts w:ascii="Calibri" w:hAnsi="Calibri" w:eastAsia="Arial Unicode MS"/>
                 <w:b/>
                 <w:color w:val="285B9D"/>
                 <w:sz w:val="36"/>
@@ -132,7 +132,7 @@
             </w:pPr>
             <w:r>
               <w:rPr>
-                <w:rFonts w:ascii="Calibri" w:hAnsi="Calibri" w:eastAsia="Heiti TC"/>
+                <w:rFonts w:ascii="Calibri" w:hAnsi="Calibri" w:eastAsia="Arial Unicode MS"/>
                 <w:b/>
                 <w:color w:val="667085"/>
                 <w:sz w:val="17"/>
@@ -142,7 +142,7 @@
             </w:r>
             <w:r>
               <w:rPr>
-                <w:rFonts w:ascii="Calibri" w:hAnsi="Calibri" w:eastAsia="Heiti TC"/>
+                <w:rFonts w:ascii="Calibri" w:hAnsi="Calibri" w:eastAsia="Arial Unicode MS"/>
                 <w:b/>
                 <w:color w:val="237A5B"/>
                 <w:sz w:val="36"/>
@@ -163,7 +163,7 @@
             </w:pPr>
             <w:r>
               <w:rPr>
-                <w:rFonts w:ascii="Calibri" w:hAnsi="Calibri" w:eastAsia="Heiti TC"/>
+                <w:rFonts w:ascii="Calibri" w:hAnsi="Calibri" w:eastAsia="Arial Unicode MS"/>
                 <w:b/>
                 <w:color w:val="667085"/>
                 <w:sz w:val="17"/>
@@ -173,7 +173,7 @@
             </w:r>
             <w:r>
               <w:rPr>
-                <w:rFonts w:ascii="Calibri" w:hAnsi="Calibri" w:eastAsia="Heiti TC"/>
+                <w:rFonts w:ascii="Calibri" w:hAnsi="Calibri" w:eastAsia="Arial Unicode MS"/>
                 <w:b/>
                 <w:color w:val="A8731B"/>
                 <w:sz w:val="36"/>
@@ -194,7 +194,7 @@
             </w:pPr>
             <w:r>
               <w:rPr>
-                <w:rFonts w:ascii="Calibri" w:hAnsi="Calibri" w:eastAsia="Heiti TC"/>
+                <w:rFonts w:ascii="Calibri" w:hAnsi="Calibri" w:eastAsia="Arial Unicode MS"/>
                 <w:b/>
                 <w:color w:val="667085"/>
                 <w:sz w:val="17"/>
@@ -204,7 +204,7 @@
             </w:r>
             <w:r>
               <w:rPr>
-                <w:rFonts w:ascii="Calibri" w:hAnsi="Calibri" w:eastAsia="Heiti TC"/>
+                <w:rFonts w:ascii="Calibri" w:hAnsi="Calibri" w:eastAsia="Arial Unicode MS"/>
                 <w:b/>
                 <w:color w:val="B43D49"/>
                 <w:sz w:val="36"/>
@@ -268,7 +268,7 @@
       </w:pPr>
       <w:r>
         <w:rPr>
-          <w:rFonts w:ascii="Calibri" w:hAnsi="Calibri" w:eastAsia="Heiti TC"/>
+          <w:rFonts w:ascii="Calibri" w:hAnsi="Calibri" w:eastAsia="Arial Unicode MS"/>
           <w:b w:val="0"/>
           <w:i/>
           <w:color w:val="667085"/>
@@ -292,7 +292,7 @@
       </w:pPr>
       <w:r>
         <w:rPr>
-          <w:rFonts w:ascii="Calibri" w:hAnsi="Calibri" w:eastAsia="Heiti TC"/>
+          <w:rFonts w:ascii="Calibri" w:hAnsi="Calibri" w:eastAsia="Arial Unicode MS"/>
           <w:b/>
           <w:color w:val="285B9D"/>
           <w:sz w:val="21"/>
@@ -304,7 +304,7 @@
           <w:rPr>
             <w:color w:val="285B9D"/>
             <w:u w:val="single"/>
-            <w:rFonts w:eastAsia="Heiti TC" w:ascii="Calibri" w:hAnsi="Calibri"/>
+            <w:rFonts w:eastAsia="Arial Unicode MS" w:ascii="Calibri" w:hAnsi="Calibri"/>
           </w:rPr>
           <w:t>电网关键设备供应链压力测试：变压器产能缺口、开关柜瓶颈与AI数据中心交付风险 是今日最高权重结论，核心证据来自 未识别，关联 工业供给瓶颈。</w:t>
         </w:r>
@@ -317,7 +317,7 @@
       </w:pPr>
       <w:r>
         <w:rPr>
-          <w:rFonts w:ascii="Calibri" w:hAnsi="Calibri" w:eastAsia="Heiti TC"/>
+          <w:rFonts w:ascii="Calibri" w:hAnsi="Calibri" w:eastAsia="Arial Unicode MS"/>
           <w:b/>
           <w:color w:val="285B9D"/>
           <w:sz w:val="21"/>
@@ -326,7 +326,7 @@
       </w:r>
       <w:r>
         <w:rPr>
-          <w:rFonts w:ascii="Calibri" w:hAnsi="Calibri" w:eastAsia="Heiti TC"/>
+          <w:rFonts w:ascii="Calibri" w:hAnsi="Calibri" w:eastAsia="Arial Unicode MS"/>
           <w:color w:val="111827"/>
           <w:sz w:val="21"/>
         </w:rPr>
@@ -340,7 +340,7 @@
       </w:pPr>
       <w:r>
         <w:rPr>
-          <w:rFonts w:ascii="Calibri" w:hAnsi="Calibri" w:eastAsia="Heiti TC"/>
+          <w:rFonts w:ascii="Calibri" w:hAnsi="Calibri" w:eastAsia="Arial Unicode MS"/>
           <w:b/>
           <w:color w:val="285B9D"/>
           <w:sz w:val="21"/>
@@ -352,7 +352,7 @@
           <w:rPr>
             <w:color w:val="285B9D"/>
             <w:u w:val="single"/>
-            <w:rFonts w:eastAsia="Heiti TC" w:ascii="Calibri" w:hAnsi="Calibri"/>
+            <w:rFonts w:eastAsia="Arial Unicode MS" w:ascii="Calibri" w:hAnsi="Calibri"/>
           </w:rPr>
           <w:t>风险矩阵最需要跟踪的是 AI 基础设施：AI 电力篮子相关性风险：公用事业分析师研究记录，2026-07-19。</w:t>
         </w:r>
@@ -365,7 +365,7 @@
       </w:pPr>
       <w:r>
         <w:rPr>
-          <w:rFonts w:ascii="Calibri" w:hAnsi="Calibri" w:eastAsia="Heiti TC"/>
+          <w:rFonts w:ascii="Calibri" w:hAnsi="Calibri" w:eastAsia="Arial Unicode MS"/>
           <w:b/>
           <w:color w:val="285B9D"/>
           <w:sz w:val="21"/>
@@ -377,7 +377,7 @@
           <w:rPr>
             <w:color w:val="285B9D"/>
             <w:u w:val="single"/>
-            <w:rFonts w:eastAsia="Heiti TC" w:ascii="Calibri" w:hAnsi="Calibri"/>
+            <w:rFonts w:eastAsia="Arial Unicode MS" w:ascii="Calibri" w:hAnsi="Calibri"/>
           </w:rPr>
           <w:t>宏观通胀传导 今日 70 条、近七日 1828 条，风险信号 1100 条。</w:t>
         </w:r>
@@ -403,7 +403,7 @@
           <w:p>
             <w:r>
               <w:rPr>
-                <w:rFonts w:ascii="Calibri" w:hAnsi="Calibri" w:eastAsia="Heiti TC"/>
+                <w:rFonts w:ascii="Calibri" w:hAnsi="Calibri" w:eastAsia="Arial Unicode MS"/>
                 <w:b/>
                 <w:color w:val="7A5A00"/>
                 <w:sz w:val="21"/>
@@ -412,7 +412,7 @@
             </w:r>
             <w:r>
               <w:rPr>
-                <w:rFonts w:ascii="Calibri" w:hAnsi="Calibri" w:eastAsia="Heiti TC"/>
+                <w:rFonts w:ascii="Calibri" w:hAnsi="Calibri" w:eastAsia="Arial Unicode MS"/>
                 <w:color w:val="7C2D12"/>
                 <w:sz w:val="21"/>
               </w:rPr>
@@ -483,7 +483,7 @@
       </w:pPr>
       <w:r>
         <w:rPr>
-          <w:rFonts w:ascii="Calibri" w:hAnsi="Calibri" w:eastAsia="Heiti TC"/>
+          <w:rFonts w:ascii="Calibri" w:hAnsi="Calibri" w:eastAsia="Arial Unicode MS"/>
           <w:b w:val="0"/>
           <w:i/>
           <w:color w:val="667085"/>
@@ -540,7 +540,7 @@
       </w:pPr>
       <w:r>
         <w:rPr>
-          <w:rFonts w:ascii="Calibri" w:hAnsi="Calibri" w:eastAsia="Heiti TC"/>
+          <w:rFonts w:ascii="Calibri" w:hAnsi="Calibri" w:eastAsia="Arial Unicode MS"/>
           <w:b w:val="0"/>
           <w:i/>
           <w:color w:val="667085"/>
@@ -602,7 +602,7 @@
       </w:pPr>
       <w:r>
         <w:rPr>
-          <w:rFonts w:ascii="Calibri" w:hAnsi="Calibri" w:eastAsia="Heiti TC"/>
+          <w:rFonts w:ascii="Calibri" w:hAnsi="Calibri" w:eastAsia="Arial Unicode MS"/>
           <w:b w:val="0"/>
           <w:i/>
           <w:color w:val="667085"/>
@@ -664,7 +664,7 @@
       </w:pPr>
       <w:r>
         <w:rPr>
-          <w:rFonts w:ascii="Calibri" w:hAnsi="Calibri" w:eastAsia="Heiti TC"/>
+          <w:rFonts w:ascii="Calibri" w:hAnsi="Calibri" w:eastAsia="Arial Unicode MS"/>
           <w:b w:val="0"/>
           <w:i/>
           <w:color w:val="667085"/>
@@ -687,7 +687,7 @@
       </w:pPr>
       <w:r>
         <w:rPr>
-          <w:rFonts w:ascii="Calibri" w:hAnsi="Calibri" w:eastAsia="Heiti TC"/>
+          <w:rFonts w:ascii="Calibri" w:hAnsi="Calibri" w:eastAsia="Arial Unicode MS"/>
           <w:b/>
           <w:i w:val="0"/>
           <w:color w:val="0B2545"/>
@@ -702,7 +702,7 @@
       </w:pPr>
       <w:r>
         <w:rPr>
-          <w:rFonts w:ascii="Calibri" w:hAnsi="Calibri" w:eastAsia="Heiti TC"/>
+          <w:rFonts w:ascii="Calibri" w:hAnsi="Calibri" w:eastAsia="Arial Unicode MS"/>
           <w:b w:val="0"/>
           <w:i w:val="0"/>
           <w:color w:val="667085"/>
@@ -717,7 +717,7 @@
       </w:pPr>
       <w:r>
         <w:rPr>
-          <w:rFonts w:ascii="Calibri" w:hAnsi="Calibri" w:eastAsia="Heiti TC"/>
+          <w:rFonts w:ascii="Calibri" w:hAnsi="Calibri" w:eastAsia="Arial Unicode MS"/>
           <w:b w:val="0"/>
           <w:i w:val="0"/>
           <w:color w:val="334155"/>
@@ -732,7 +732,7 @@
       </w:pPr>
       <w:r>
         <w:rPr>
-          <w:rFonts w:ascii="Calibri" w:hAnsi="Calibri" w:eastAsia="Heiti TC"/>
+          <w:rFonts w:ascii="Calibri" w:hAnsi="Calibri" w:eastAsia="Arial Unicode MS"/>
           <w:b w:val="0"/>
           <w:i w:val="0"/>
           <w:color w:val="667085"/>
@@ -745,7 +745,7 @@
           <w:rPr>
             <w:color w:val="285B9D"/>
             <w:u w:val="single"/>
-            <w:rFonts w:eastAsia="Heiti TC" w:ascii="Calibri" w:hAnsi="Calibri"/>
+            <w:rFonts w:eastAsia="Arial Unicode MS" w:ascii="Calibri" w:hAnsi="Calibri"/>
           </w:rPr>
           <w:t>reports/archive-2edfd7e782e3</w:t>
         </w:r>
@@ -757,7 +757,7 @@
       </w:pPr>
       <w:r>
         <w:rPr>
-          <w:rFonts w:ascii="Calibri" w:hAnsi="Calibri" w:eastAsia="Heiti TC"/>
+          <w:rFonts w:ascii="Calibri" w:hAnsi="Calibri" w:eastAsia="Arial Unicode MS"/>
           <w:b/>
           <w:i w:val="0"/>
           <w:color w:val="0B2545"/>
@@ -772,7 +772,7 @@
       </w:pPr>
       <w:r>
         <w:rPr>
-          <w:rFonts w:ascii="Calibri" w:hAnsi="Calibri" w:eastAsia="Heiti TC"/>
+          <w:rFonts w:ascii="Calibri" w:hAnsi="Calibri" w:eastAsia="Arial Unicode MS"/>
           <w:b w:val="0"/>
           <w:i w:val="0"/>
           <w:color w:val="667085"/>
@@ -787,7 +787,7 @@
       </w:pPr>
       <w:r>
         <w:rPr>
-          <w:rFonts w:ascii="Calibri" w:hAnsi="Calibri" w:eastAsia="Heiti TC"/>
+          <w:rFonts w:ascii="Calibri" w:hAnsi="Calibri" w:eastAsia="Arial Unicode MS"/>
           <w:b w:val="0"/>
           <w:i w:val="0"/>
           <w:color w:val="334155"/>
@@ -802,7 +802,7 @@
       </w:pPr>
       <w:r>
         <w:rPr>
-          <w:rFonts w:ascii="Calibri" w:hAnsi="Calibri" w:eastAsia="Heiti TC"/>
+          <w:rFonts w:ascii="Calibri" w:hAnsi="Calibri" w:eastAsia="Arial Unicode MS"/>
           <w:b w:val="0"/>
           <w:i w:val="0"/>
           <w:color w:val="667085"/>
@@ -815,7 +815,7 @@
           <w:rPr>
             <w:color w:val="285B9D"/>
             <w:u w:val="single"/>
-            <w:rFonts w:eastAsia="Heiti TC" w:ascii="Calibri" w:hAnsi="Calibri"/>
+            <w:rFonts w:eastAsia="Arial Unicode MS" w:ascii="Calibri" w:hAnsi="Calibri"/>
           </w:rPr>
           <w:t>reports/archive-38082c85b96a</w:t>
         </w:r>
@@ -827,7 +827,7 @@
       </w:pPr>
       <w:r>
         <w:rPr>
-          <w:rFonts w:ascii="Calibri" w:hAnsi="Calibri" w:eastAsia="Heiti TC"/>
+          <w:rFonts w:ascii="Calibri" w:hAnsi="Calibri" w:eastAsia="Arial Unicode MS"/>
           <w:b/>
           <w:i w:val="0"/>
           <w:color w:val="0B2545"/>
@@ -842,7 +842,7 @@
       </w:pPr>
       <w:r>
         <w:rPr>
-          <w:rFonts w:ascii="Calibri" w:hAnsi="Calibri" w:eastAsia="Heiti TC"/>
+          <w:rFonts w:ascii="Calibri" w:hAnsi="Calibri" w:eastAsia="Arial Unicode MS"/>
           <w:b w:val="0"/>
           <w:i w:val="0"/>
           <w:color w:val="667085"/>
@@ -857,7 +857,7 @@
       </w:pPr>
       <w:r>
         <w:rPr>
-          <w:rFonts w:ascii="Calibri" w:hAnsi="Calibri" w:eastAsia="Heiti TC"/>
+          <w:rFonts w:ascii="Calibri" w:hAnsi="Calibri" w:eastAsia="Arial Unicode MS"/>
           <w:b w:val="0"/>
           <w:i w:val="0"/>
           <w:color w:val="334155"/>
@@ -872,7 +872,7 @@
       </w:pPr>
       <w:r>
         <w:rPr>
-          <w:rFonts w:ascii="Calibri" w:hAnsi="Calibri" w:eastAsia="Heiti TC"/>
+          <w:rFonts w:ascii="Calibri" w:hAnsi="Calibri" w:eastAsia="Arial Unicode MS"/>
           <w:b w:val="0"/>
           <w:i w:val="0"/>
           <w:color w:val="667085"/>
@@ -885,7 +885,7 @@
           <w:rPr>
             <w:color w:val="285B9D"/>
             <w:u w:val="single"/>
-            <w:rFonts w:eastAsia="Heiti TC" w:ascii="Calibri" w:hAnsi="Calibri"/>
+            <w:rFonts w:eastAsia="Arial Unicode MS" w:ascii="Calibri" w:hAnsi="Calibri"/>
           </w:rPr>
           <w:t>reports/archive-0ad2bb3b60e1</w:t>
         </w:r>
@@ -897,7 +897,7 @@
       </w:pPr>
       <w:r>
         <w:rPr>
-          <w:rFonts w:ascii="Calibri" w:hAnsi="Calibri" w:eastAsia="Heiti TC"/>
+          <w:rFonts w:ascii="Calibri" w:hAnsi="Calibri" w:eastAsia="Arial Unicode MS"/>
           <w:b/>
           <w:i w:val="0"/>
           <w:color w:val="0B2545"/>
@@ -912,7 +912,7 @@
       </w:pPr>
       <w:r>
         <w:rPr>
-          <w:rFonts w:ascii="Calibri" w:hAnsi="Calibri" w:eastAsia="Heiti TC"/>
+          <w:rFonts w:ascii="Calibri" w:hAnsi="Calibri" w:eastAsia="Arial Unicode MS"/>
           <w:b w:val="0"/>
           <w:i w:val="0"/>
           <w:color w:val="667085"/>
@@ -927,7 +927,7 @@
       </w:pPr>
       <w:r>
         <w:rPr>
-          <w:rFonts w:ascii="Calibri" w:hAnsi="Calibri" w:eastAsia="Heiti TC"/>
+          <w:rFonts w:ascii="Calibri" w:hAnsi="Calibri" w:eastAsia="Arial Unicode MS"/>
           <w:b w:val="0"/>
           <w:i w:val="0"/>
           <w:color w:val="334155"/>
@@ -942,7 +942,7 @@
       </w:pPr>
       <w:r>
         <w:rPr>
-          <w:rFonts w:ascii="Calibri" w:hAnsi="Calibri" w:eastAsia="Heiti TC"/>
+          <w:rFonts w:ascii="Calibri" w:hAnsi="Calibri" w:eastAsia="Arial Unicode MS"/>
           <w:b w:val="0"/>
           <w:i w:val="0"/>
           <w:color w:val="667085"/>
@@ -955,7 +955,7 @@
           <w:rPr>
             <w:color w:val="285B9D"/>
             <w:u w:val="single"/>
-            <w:rFonts w:eastAsia="Heiti TC" w:ascii="Calibri" w:hAnsi="Calibri"/>
+            <w:rFonts w:eastAsia="Arial Unicode MS" w:ascii="Calibri" w:hAnsi="Calibri"/>
           </w:rPr>
           <w:t>reports/archive-5c570dc15b07</w:t>
         </w:r>
@@ -967,7 +967,7 @@
       </w:pPr>
       <w:r>
         <w:rPr>
-          <w:rFonts w:ascii="Calibri" w:hAnsi="Calibri" w:eastAsia="Heiti TC"/>
+          <w:rFonts w:ascii="Calibri" w:hAnsi="Calibri" w:eastAsia="Arial Unicode MS"/>
           <w:b/>
           <w:i w:val="0"/>
           <w:color w:val="0B2545"/>
@@ -982,7 +982,7 @@
       </w:pPr>
       <w:r>
         <w:rPr>
-          <w:rFonts w:ascii="Calibri" w:hAnsi="Calibri" w:eastAsia="Heiti TC"/>
+          <w:rFonts w:ascii="Calibri" w:hAnsi="Calibri" w:eastAsia="Arial Unicode MS"/>
           <w:b w:val="0"/>
           <w:i w:val="0"/>
           <w:color w:val="667085"/>
@@ -997,7 +997,7 @@
       </w:pPr>
       <w:r>
         <w:rPr>
-          <w:rFonts w:ascii="Calibri" w:hAnsi="Calibri" w:eastAsia="Heiti TC"/>
+          <w:rFonts w:ascii="Calibri" w:hAnsi="Calibri" w:eastAsia="Arial Unicode MS"/>
           <w:b w:val="0"/>
           <w:i w:val="0"/>
           <w:color w:val="334155"/>
@@ -1012,7 +1012,7 @@
       </w:pPr>
       <w:r>
         <w:rPr>
-          <w:rFonts w:ascii="Calibri" w:hAnsi="Calibri" w:eastAsia="Heiti TC"/>
+          <w:rFonts w:ascii="Calibri" w:hAnsi="Calibri" w:eastAsia="Arial Unicode MS"/>
           <w:b w:val="0"/>
           <w:i w:val="0"/>
           <w:color w:val="667085"/>
@@ -1025,7 +1025,7 @@
           <w:rPr>
             <w:color w:val="285B9D"/>
             <w:u w:val="single"/>
-            <w:rFonts w:eastAsia="Heiti TC" w:ascii="Calibri" w:hAnsi="Calibri"/>
+            <w:rFonts w:eastAsia="Arial Unicode MS" w:ascii="Calibri" w:hAnsi="Calibri"/>
           </w:rPr>
           <w:t>reports/archive-3a08992a429f</w:t>
         </w:r>
@@ -1037,7 +1037,7 @@
       </w:pPr>
       <w:r>
         <w:rPr>
-          <w:rFonts w:ascii="Calibri" w:hAnsi="Calibri" w:eastAsia="Heiti TC"/>
+          <w:rFonts w:ascii="Calibri" w:hAnsi="Calibri" w:eastAsia="Arial Unicode MS"/>
           <w:b/>
           <w:i w:val="0"/>
           <w:color w:val="0B2545"/>
@@ -1052,7 +1052,7 @@
       </w:pPr>
       <w:r>
         <w:rPr>
-          <w:rFonts w:ascii="Calibri" w:hAnsi="Calibri" w:eastAsia="Heiti TC"/>
+          <w:rFonts w:ascii="Calibri" w:hAnsi="Calibri" w:eastAsia="Arial Unicode MS"/>
           <w:b w:val="0"/>
           <w:i w:val="0"/>
           <w:color w:val="667085"/>
@@ -1067,7 +1067,7 @@
       </w:pPr>
       <w:r>
         <w:rPr>
-          <w:rFonts w:ascii="Calibri" w:hAnsi="Calibri" w:eastAsia="Heiti TC"/>
+          <w:rFonts w:ascii="Calibri" w:hAnsi="Calibri" w:eastAsia="Arial Unicode MS"/>
           <w:b w:val="0"/>
           <w:i w:val="0"/>
           <w:color w:val="334155"/>
@@ -1082,7 +1082,7 @@
       </w:pPr>
       <w:r>
         <w:rPr>
-          <w:rFonts w:ascii="Calibri" w:hAnsi="Calibri" w:eastAsia="Heiti TC"/>
+          <w:rFonts w:ascii="Calibri" w:hAnsi="Calibri" w:eastAsia="Arial Unicode MS"/>
           <w:b w:val="0"/>
           <w:i w:val="0"/>
           <w:color w:val="667085"/>
@@ -1095,7 +1095,7 @@
           <w:rPr>
             <w:color w:val="285B9D"/>
             <w:u w:val="single"/>
-            <w:rFonts w:eastAsia="Heiti TC" w:ascii="Calibri" w:hAnsi="Calibri"/>
+            <w:rFonts w:eastAsia="Arial Unicode MS" w:ascii="Calibri" w:hAnsi="Calibri"/>
           </w:rPr>
           <w:t>reports/archive-13561fd6d514</w:t>
         </w:r>
@@ -1115,7 +1115,7 @@
       </w:pPr>
       <w:r>
         <w:rPr>
-          <w:rFonts w:ascii="Calibri" w:hAnsi="Calibri" w:eastAsia="Heiti TC"/>
+          <w:rFonts w:ascii="Calibri" w:hAnsi="Calibri" w:eastAsia="Arial Unicode MS"/>
           <w:b/>
           <w:i w:val="0"/>
           <w:color w:val="0B2545"/>
@@ -1130,7 +1130,7 @@
       </w:pPr>
       <w:r>
         <w:rPr>
-          <w:rFonts w:ascii="Calibri" w:hAnsi="Calibri" w:eastAsia="Heiti TC"/>
+          <w:rFonts w:ascii="Calibri" w:hAnsi="Calibri" w:eastAsia="Arial Unicode MS"/>
           <w:b w:val="0"/>
           <w:i w:val="0"/>
           <w:color w:val="334155"/>
@@ -1145,7 +1145,7 @@
       </w:pPr>
       <w:r>
         <w:rPr>
-          <w:rFonts w:ascii="Calibri" w:hAnsi="Calibri" w:eastAsia="Heiti TC"/>
+          <w:rFonts w:ascii="Calibri" w:hAnsi="Calibri" w:eastAsia="Arial Unicode MS"/>
           <w:b w:val="0"/>
           <w:i w:val="0"/>
           <w:color w:val="667085"/>
@@ -1158,7 +1158,7 @@
           <w:rPr>
             <w:color w:val="285B9D"/>
             <w:u w:val="single"/>
-            <w:rFonts w:eastAsia="Heiti TC" w:ascii="Calibri" w:hAnsi="Calibri"/>
+            <w:rFonts w:eastAsia="Arial Unicode MS" w:ascii="Calibri" w:hAnsi="Calibri"/>
           </w:rPr>
           <w:t>reports/archive-220e9e773378</w:t>
         </w:r>
@@ -1170,7 +1170,7 @@
       </w:pPr>
       <w:r>
         <w:rPr>
-          <w:rFonts w:ascii="Calibri" w:hAnsi="Calibri" w:eastAsia="Heiti TC"/>
+          <w:rFonts w:ascii="Calibri" w:hAnsi="Calibri" w:eastAsia="Arial Unicode MS"/>
           <w:b/>
           <w:i w:val="0"/>
           <w:color w:val="0B2545"/>
@@ -1185,7 +1185,7 @@
       </w:pPr>
       <w:r>
         <w:rPr>
-          <w:rFonts w:ascii="Calibri" w:hAnsi="Calibri" w:eastAsia="Heiti TC"/>
+          <w:rFonts w:ascii="Calibri" w:hAnsi="Calibri" w:eastAsia="Arial Unicode MS"/>
           <w:b w:val="0"/>
           <w:i w:val="0"/>
           <w:color w:val="334155"/>
@@ -1200,7 +1200,7 @@
       </w:pPr>
       <w:r>
         <w:rPr>
-          <w:rFonts w:ascii="Calibri" w:hAnsi="Calibri" w:eastAsia="Heiti TC"/>
+          <w:rFonts w:ascii="Calibri" w:hAnsi="Calibri" w:eastAsia="Arial Unicode MS"/>
           <w:b w:val="0"/>
           <w:i w:val="0"/>
           <w:color w:val="667085"/>
@@ -1213,7 +1213,7 @@
           <w:rPr>
             <w:color w:val="285B9D"/>
             <w:u w:val="single"/>
-            <w:rFonts w:eastAsia="Heiti TC" w:ascii="Calibri" w:hAnsi="Calibri"/>
+            <w:rFonts w:eastAsia="Arial Unicode MS" w:ascii="Calibri" w:hAnsi="Calibri"/>
           </w:rPr>
           <w:t>reports/archive-29627640e1a7</w:t>
         </w:r>
@@ -1225,7 +1225,7 @@
       </w:pPr>
       <w:r>
         <w:rPr>
-          <w:rFonts w:ascii="Calibri" w:hAnsi="Calibri" w:eastAsia="Heiti TC"/>
+          <w:rFonts w:ascii="Calibri" w:hAnsi="Calibri" w:eastAsia="Arial Unicode MS"/>
           <w:b/>
           <w:i w:val="0"/>
           <w:color w:val="0B2545"/>
@@ -1240,7 +1240,7 @@
       </w:pPr>
       <w:r>
         <w:rPr>
-          <w:rFonts w:ascii="Calibri" w:hAnsi="Calibri" w:eastAsia="Heiti TC"/>
+          <w:rFonts w:ascii="Calibri" w:hAnsi="Calibri" w:eastAsia="Arial Unicode MS"/>
           <w:b w:val="0"/>
           <w:i w:val="0"/>
           <w:color w:val="334155"/>
@@ -1255,7 +1255,7 @@
       </w:pPr>
       <w:r>
         <w:rPr>
-          <w:rFonts w:ascii="Calibri" w:hAnsi="Calibri" w:eastAsia="Heiti TC"/>
+          <w:rFonts w:ascii="Calibri" w:hAnsi="Calibri" w:eastAsia="Arial Unicode MS"/>
           <w:b w:val="0"/>
           <w:i w:val="0"/>
           <w:color w:val="667085"/>
@@ -1268,7 +1268,7 @@
           <w:rPr>
             <w:color w:val="285B9D"/>
             <w:u w:val="single"/>
-            <w:rFonts w:eastAsia="Heiti TC" w:ascii="Calibri" w:hAnsi="Calibri"/>
+            <w:rFonts w:eastAsia="Arial Unicode MS" w:ascii="Calibri" w:hAnsi="Calibri"/>
           </w:rPr>
           <w:t>reports/archive-2edfd7e782e3</w:t>
         </w:r>
@@ -1311,7 +1311,7 @@
             <w:r/>
             <w:r>
               <w:rPr>
-                <w:rFonts w:ascii="Calibri" w:hAnsi="Calibri" w:eastAsia="Heiti TC"/>
+                <w:rFonts w:ascii="Calibri" w:hAnsi="Calibri" w:eastAsia="Arial Unicode MS"/>
                 <w:b/>
                 <w:color w:val="475569"/>
                 <w:sz w:val="18"/>
@@ -1334,7 +1334,7 @@
             <w:r/>
             <w:r>
               <w:rPr>
-                <w:rFonts w:ascii="Calibri" w:hAnsi="Calibri" w:eastAsia="Heiti TC"/>
+                <w:rFonts w:ascii="Calibri" w:hAnsi="Calibri" w:eastAsia="Arial Unicode MS"/>
                 <w:b/>
                 <w:color w:val="475569"/>
                 <w:sz w:val="18"/>
@@ -1357,7 +1357,7 @@
             <w:r/>
             <w:r>
               <w:rPr>
-                <w:rFonts w:ascii="Calibri" w:hAnsi="Calibri" w:eastAsia="Heiti TC"/>
+                <w:rFonts w:ascii="Calibri" w:hAnsi="Calibri" w:eastAsia="Arial Unicode MS"/>
                 <w:b/>
                 <w:color w:val="475569"/>
                 <w:sz w:val="18"/>
@@ -1380,7 +1380,7 @@
             <w:r/>
             <w:r>
               <w:rPr>
-                <w:rFonts w:ascii="Calibri" w:hAnsi="Calibri" w:eastAsia="Heiti TC"/>
+                <w:rFonts w:ascii="Calibri" w:hAnsi="Calibri" w:eastAsia="Arial Unicode MS"/>
                 <w:b/>
                 <w:color w:val="475569"/>
                 <w:sz w:val="18"/>
@@ -1403,7 +1403,7 @@
             <w:r/>
             <w:r>
               <w:rPr>
-                <w:rFonts w:ascii="Calibri" w:hAnsi="Calibri" w:eastAsia="Heiti TC"/>
+                <w:rFonts w:ascii="Calibri" w:hAnsi="Calibri" w:eastAsia="Arial Unicode MS"/>
                 <w:b/>
                 <w:color w:val="475569"/>
                 <w:sz w:val="18"/>
@@ -1426,7 +1426,7 @@
             <w:r/>
             <w:r>
               <w:rPr>
-                <w:rFonts w:ascii="Calibri" w:hAnsi="Calibri" w:eastAsia="Heiti TC"/>
+                <w:rFonts w:ascii="Calibri" w:hAnsi="Calibri" w:eastAsia="Arial Unicode MS"/>
                 <w:b w:val="0"/>
                 <w:color w:val="111827"/>
                 <w:sz w:val="17"/>
@@ -1447,7 +1447,7 @@
             <w:r/>
             <w:r>
               <w:rPr>
-                <w:rFonts w:ascii="Calibri" w:hAnsi="Calibri" w:eastAsia="Heiti TC"/>
+                <w:rFonts w:ascii="Calibri" w:hAnsi="Calibri" w:eastAsia="Arial Unicode MS"/>
                 <w:b w:val="0"/>
                 <w:color w:val="111827"/>
                 <w:sz w:val="16"/>
@@ -1468,7 +1468,7 @@
             <w:r/>
             <w:r>
               <w:rPr>
-                <w:rFonts w:ascii="Calibri" w:hAnsi="Calibri" w:eastAsia="Heiti TC"/>
+                <w:rFonts w:ascii="Calibri" w:hAnsi="Calibri" w:eastAsia="Arial Unicode MS"/>
                 <w:b w:val="0"/>
                 <w:color w:val="111827"/>
                 <w:sz w:val="16"/>
@@ -1490,7 +1490,7 @@
             <w:r/>
             <w:r>
               <w:rPr>
-                <w:rFonts w:ascii="Calibri" w:hAnsi="Calibri" w:eastAsia="Heiti TC"/>
+                <w:rFonts w:ascii="Calibri" w:hAnsi="Calibri" w:eastAsia="Arial Unicode MS"/>
                 <w:b/>
                 <w:color w:val="111827"/>
                 <w:sz w:val="17"/>
@@ -1512,7 +1512,7 @@
             <w:r/>
             <w:r>
               <w:rPr>
-                <w:rFonts w:ascii="Calibri" w:hAnsi="Calibri" w:eastAsia="Heiti TC"/>
+                <w:rFonts w:ascii="Calibri" w:hAnsi="Calibri" w:eastAsia="Arial Unicode MS"/>
                 <w:b w:val="0"/>
                 <w:color w:val="111827"/>
                 <w:sz w:val="16"/>
@@ -1535,7 +1535,7 @@
             <w:r/>
             <w:r>
               <w:rPr>
-                <w:rFonts w:ascii="Calibri" w:hAnsi="Calibri" w:eastAsia="Heiti TC"/>
+                <w:rFonts w:ascii="Calibri" w:hAnsi="Calibri" w:eastAsia="Arial Unicode MS"/>
                 <w:b w:val="0"/>
                 <w:color w:val="111827"/>
                 <w:sz w:val="17"/>
@@ -1556,7 +1556,7 @@
             <w:r/>
             <w:r>
               <w:rPr>
-                <w:rFonts w:ascii="Calibri" w:hAnsi="Calibri" w:eastAsia="Heiti TC"/>
+                <w:rFonts w:ascii="Calibri" w:hAnsi="Calibri" w:eastAsia="Arial Unicode MS"/>
                 <w:b w:val="0"/>
                 <w:color w:val="111827"/>
                 <w:sz w:val="16"/>
@@ -1577,7 +1577,7 @@
             <w:r/>
             <w:r>
               <w:rPr>
-                <w:rFonts w:ascii="Calibri" w:hAnsi="Calibri" w:eastAsia="Heiti TC"/>
+                <w:rFonts w:ascii="Calibri" w:hAnsi="Calibri" w:eastAsia="Arial Unicode MS"/>
                 <w:b w:val="0"/>
                 <w:color w:val="111827"/>
                 <w:sz w:val="16"/>
@@ -1599,7 +1599,7 @@
             <w:r/>
             <w:r>
               <w:rPr>
-                <w:rFonts w:ascii="Calibri" w:hAnsi="Calibri" w:eastAsia="Heiti TC"/>
+                <w:rFonts w:ascii="Calibri" w:hAnsi="Calibri" w:eastAsia="Arial Unicode MS"/>
                 <w:b/>
                 <w:color w:val="111827"/>
                 <w:sz w:val="17"/>
@@ -1621,7 +1621,7 @@
             <w:r/>
             <w:r>
               <w:rPr>
-                <w:rFonts w:ascii="Calibri" w:hAnsi="Calibri" w:eastAsia="Heiti TC"/>
+                <w:rFonts w:ascii="Calibri" w:hAnsi="Calibri" w:eastAsia="Arial Unicode MS"/>
                 <w:b w:val="0"/>
                 <w:color w:val="111827"/>
                 <w:sz w:val="16"/>
@@ -1644,7 +1644,7 @@
             <w:r/>
             <w:r>
               <w:rPr>
-                <w:rFonts w:ascii="Calibri" w:hAnsi="Calibri" w:eastAsia="Heiti TC"/>
+                <w:rFonts w:ascii="Calibri" w:hAnsi="Calibri" w:eastAsia="Arial Unicode MS"/>
                 <w:b w:val="0"/>
                 <w:color w:val="111827"/>
                 <w:sz w:val="17"/>
@@ -1665,7 +1665,7 @@
             <w:r/>
             <w:r>
               <w:rPr>
-                <w:rFonts w:ascii="Calibri" w:hAnsi="Calibri" w:eastAsia="Heiti TC"/>
+                <w:rFonts w:ascii="Calibri" w:hAnsi="Calibri" w:eastAsia="Arial Unicode MS"/>
                 <w:b w:val="0"/>
                 <w:color w:val="111827"/>
                 <w:sz w:val="16"/>
@@ -1686,7 +1686,7 @@
             <w:r/>
             <w:r>
               <w:rPr>
-                <w:rFonts w:ascii="Calibri" w:hAnsi="Calibri" w:eastAsia="Heiti TC"/>
+                <w:rFonts w:ascii="Calibri" w:hAnsi="Calibri" w:eastAsia="Arial Unicode MS"/>
                 <w:b w:val="0"/>
                 <w:color w:val="111827"/>
                 <w:sz w:val="16"/>
@@ -1708,7 +1708,7 @@
             <w:r/>
             <w:r>
               <w:rPr>
-                <w:rFonts w:ascii="Calibri" w:hAnsi="Calibri" w:eastAsia="Heiti TC"/>
+                <w:rFonts w:ascii="Calibri" w:hAnsi="Calibri" w:eastAsia="Arial Unicode MS"/>
                 <w:b/>
                 <w:color w:val="111827"/>
                 <w:sz w:val="17"/>
@@ -1730,7 +1730,7 @@
             <w:r/>
             <w:r>
               <w:rPr>
-                <w:rFonts w:ascii="Calibri" w:hAnsi="Calibri" w:eastAsia="Heiti TC"/>
+                <w:rFonts w:ascii="Calibri" w:hAnsi="Calibri" w:eastAsia="Arial Unicode MS"/>
                 <w:b w:val="0"/>
                 <w:color w:val="111827"/>
                 <w:sz w:val="16"/>
@@ -1753,7 +1753,7 @@
             <w:r/>
             <w:r>
               <w:rPr>
-                <w:rFonts w:ascii="Calibri" w:hAnsi="Calibri" w:eastAsia="Heiti TC"/>
+                <w:rFonts w:ascii="Calibri" w:hAnsi="Calibri" w:eastAsia="Arial Unicode MS"/>
                 <w:b w:val="0"/>
                 <w:color w:val="111827"/>
                 <w:sz w:val="17"/>
@@ -1774,7 +1774,7 @@
             <w:r/>
             <w:r>
               <w:rPr>
-                <w:rFonts w:ascii="Calibri" w:hAnsi="Calibri" w:eastAsia="Heiti TC"/>
+                <w:rFonts w:ascii="Calibri" w:hAnsi="Calibri" w:eastAsia="Arial Unicode MS"/>
                 <w:b w:val="0"/>
                 <w:color w:val="111827"/>
                 <w:sz w:val="16"/>
@@ -1795,7 +1795,7 @@
             <w:r/>
             <w:r>
               <w:rPr>
-                <w:rFonts w:ascii="Calibri" w:hAnsi="Calibri" w:eastAsia="Heiti TC"/>
+                <w:rFonts w:ascii="Calibri" w:hAnsi="Calibri" w:eastAsia="Arial Unicode MS"/>
                 <w:b w:val="0"/>
                 <w:color w:val="111827"/>
                 <w:sz w:val="16"/>
@@ -1817,7 +1817,7 @@
             <w:r/>
             <w:r>
               <w:rPr>
-                <w:rFonts w:ascii="Calibri" w:hAnsi="Calibri" w:eastAsia="Heiti TC"/>
+                <w:rFonts w:ascii="Calibri" w:hAnsi="Calibri" w:eastAsia="Arial Unicode MS"/>
                 <w:b/>
                 <w:color w:val="111827"/>
                 <w:sz w:val="17"/>
@@ -1839,7 +1839,7 @@
             <w:r/>
             <w:r>
               <w:rPr>
-                <w:rFonts w:ascii="Calibri" w:hAnsi="Calibri" w:eastAsia="Heiti TC"/>
+                <w:rFonts w:ascii="Calibri" w:hAnsi="Calibri" w:eastAsia="Arial Unicode MS"/>
                 <w:b w:val="0"/>
                 <w:color w:val="111827"/>
                 <w:sz w:val="16"/>
@@ -1862,7 +1862,7 @@
             <w:r/>
             <w:r>
               <w:rPr>
-                <w:rFonts w:ascii="Calibri" w:hAnsi="Calibri" w:eastAsia="Heiti TC"/>
+                <w:rFonts w:ascii="Calibri" w:hAnsi="Calibri" w:eastAsia="Arial Unicode MS"/>
                 <w:b w:val="0"/>
                 <w:color w:val="111827"/>
                 <w:sz w:val="17"/>
@@ -1883,7 +1883,7 @@
             <w:r/>
             <w:r>
               <w:rPr>
-                <w:rFonts w:ascii="Calibri" w:hAnsi="Calibri" w:eastAsia="Heiti TC"/>
+                <w:rFonts w:ascii="Calibri" w:hAnsi="Calibri" w:eastAsia="Arial Unicode MS"/>
                 <w:b w:val="0"/>
                 <w:color w:val="111827"/>
                 <w:sz w:val="16"/>
@@ -1904,7 +1904,7 @@
             <w:r/>
             <w:r>
               <w:rPr>
-                <w:rFonts w:ascii="Calibri" w:hAnsi="Calibri" w:eastAsia="Heiti TC"/>
+                <w:rFonts w:ascii="Calibri" w:hAnsi="Calibri" w:eastAsia="Arial Unicode MS"/>
                 <w:b w:val="0"/>
                 <w:color w:val="111827"/>
                 <w:sz w:val="16"/>
@@ -1926,7 +1926,7 @@
             <w:r/>
             <w:r>
               <w:rPr>
-                <w:rFonts w:ascii="Calibri" w:hAnsi="Calibri" w:eastAsia="Heiti TC"/>
+                <w:rFonts w:ascii="Calibri" w:hAnsi="Calibri" w:eastAsia="Arial Unicode MS"/>
                 <w:b/>
                 <w:color w:val="111827"/>
                 <w:sz w:val="17"/>
@@ -1948,7 +1948,7 @@
             <w:r/>
             <w:r>
               <w:rPr>
-                <w:rFonts w:ascii="Calibri" w:hAnsi="Calibri" w:eastAsia="Heiti TC"/>
+                <w:rFonts w:ascii="Calibri" w:hAnsi="Calibri" w:eastAsia="Arial Unicode MS"/>
                 <w:b w:val="0"/>
                 <w:color w:val="111827"/>
                 <w:sz w:val="16"/>
@@ -1971,7 +1971,7 @@
             <w:r/>
             <w:r>
               <w:rPr>
-                <w:rFonts w:ascii="Calibri" w:hAnsi="Calibri" w:eastAsia="Heiti TC"/>
+                <w:rFonts w:ascii="Calibri" w:hAnsi="Calibri" w:eastAsia="Arial Unicode MS"/>
                 <w:b w:val="0"/>
                 <w:color w:val="111827"/>
                 <w:sz w:val="17"/>
@@ -1992,7 +1992,7 @@
             <w:r/>
             <w:r>
               <w:rPr>
-                <w:rFonts w:ascii="Calibri" w:hAnsi="Calibri" w:eastAsia="Heiti TC"/>
+                <w:rFonts w:ascii="Calibri" w:hAnsi="Calibri" w:eastAsia="Arial Unicode MS"/>
                 <w:b w:val="0"/>
                 <w:color w:val="111827"/>
                 <w:sz w:val="16"/>
@@ -2013,7 +2013,7 @@
             <w:r/>
             <w:r>
               <w:rPr>
-                <w:rFonts w:ascii="Calibri" w:hAnsi="Calibri" w:eastAsia="Heiti TC"/>
+                <w:rFonts w:ascii="Calibri" w:hAnsi="Calibri" w:eastAsia="Arial Unicode MS"/>
                 <w:b w:val="0"/>
                 <w:color w:val="111827"/>
                 <w:sz w:val="16"/>
@@ -2035,7 +2035,7 @@
             <w:r/>
             <w:r>
               <w:rPr>
-                <w:rFonts w:ascii="Calibri" w:hAnsi="Calibri" w:eastAsia="Heiti TC"/>
+                <w:rFonts w:ascii="Calibri" w:hAnsi="Calibri" w:eastAsia="Arial Unicode MS"/>
                 <w:b/>
                 <w:color w:val="111827"/>
                 <w:sz w:val="17"/>
@@ -2057,7 +2057,7 @@
             <w:r/>
             <w:r>
               <w:rPr>
-                <w:rFonts w:ascii="Calibri" w:hAnsi="Calibri" w:eastAsia="Heiti TC"/>
+                <w:rFonts w:ascii="Calibri" w:hAnsi="Calibri" w:eastAsia="Arial Unicode MS"/>
                 <w:b w:val="0"/>
                 <w:color w:val="111827"/>
                 <w:sz w:val="16"/>
@@ -2080,7 +2080,7 @@
             <w:r/>
             <w:r>
               <w:rPr>
-                <w:rFonts w:ascii="Calibri" w:hAnsi="Calibri" w:eastAsia="Heiti TC"/>
+                <w:rFonts w:ascii="Calibri" w:hAnsi="Calibri" w:eastAsia="Arial Unicode MS"/>
                 <w:b w:val="0"/>
                 <w:color w:val="111827"/>
                 <w:sz w:val="17"/>
@@ -2101,7 +2101,7 @@
             <w:r/>
             <w:r>
               <w:rPr>
-                <w:rFonts w:ascii="Calibri" w:hAnsi="Calibri" w:eastAsia="Heiti TC"/>
+                <w:rFonts w:ascii="Calibri" w:hAnsi="Calibri" w:eastAsia="Arial Unicode MS"/>
                 <w:b w:val="0"/>
                 <w:color w:val="111827"/>
                 <w:sz w:val="16"/>
@@ -2122,7 +2122,7 @@
             <w:r/>
             <w:r>
               <w:rPr>
-                <w:rFonts w:ascii="Calibri" w:hAnsi="Calibri" w:eastAsia="Heiti TC"/>
+                <w:rFonts w:ascii="Calibri" w:hAnsi="Calibri" w:eastAsia="Arial Unicode MS"/>
                 <w:b w:val="0"/>
                 <w:color w:val="111827"/>
                 <w:sz w:val="16"/>
@@ -2144,7 +2144,7 @@
             <w:r/>
             <w:r>
               <w:rPr>
-                <w:rFonts w:ascii="Calibri" w:hAnsi="Calibri" w:eastAsia="Heiti TC"/>
+                <w:rFonts w:ascii="Calibri" w:hAnsi="Calibri" w:eastAsia="Arial Unicode MS"/>
                 <w:b/>
                 <w:color w:val="111827"/>
                 <w:sz w:val="17"/>
@@ -2166,7 +2166,7 @@
             <w:r/>
             <w:r>
               <w:rPr>
-                <w:rFonts w:ascii="Calibri" w:hAnsi="Calibri" w:eastAsia="Heiti TC"/>
+                <w:rFonts w:ascii="Calibri" w:hAnsi="Calibri" w:eastAsia="Arial Unicode MS"/>
                 <w:b w:val="0"/>
                 <w:color w:val="111827"/>
                 <w:sz w:val="16"/>
@@ -2189,7 +2189,7 @@
             <w:r/>
             <w:r>
               <w:rPr>
-                <w:rFonts w:ascii="Calibri" w:hAnsi="Calibri" w:eastAsia="Heiti TC"/>
+                <w:rFonts w:ascii="Calibri" w:hAnsi="Calibri" w:eastAsia="Arial Unicode MS"/>
                 <w:b w:val="0"/>
                 <w:color w:val="111827"/>
                 <w:sz w:val="17"/>
@@ -2210,7 +2210,7 @@
             <w:r/>
             <w:r>
               <w:rPr>
-                <w:rFonts w:ascii="Calibri" w:hAnsi="Calibri" w:eastAsia="Heiti TC"/>
+                <w:rFonts w:ascii="Calibri" w:hAnsi="Calibri" w:eastAsia="Arial Unicode MS"/>
                 <w:b w:val="0"/>
                 <w:color w:val="111827"/>
                 <w:sz w:val="16"/>
@@ -2231,7 +2231,7 @@
             <w:r/>
             <w:r>
               <w:rPr>
-                <w:rFonts w:ascii="Calibri" w:hAnsi="Calibri" w:eastAsia="Heiti TC"/>
+                <w:rFonts w:ascii="Calibri" w:hAnsi="Calibri" w:eastAsia="Arial Unicode MS"/>
                 <w:b w:val="0"/>
                 <w:color w:val="111827"/>
                 <w:sz w:val="16"/>
@@ -2253,7 +2253,7 @@
             <w:r/>
             <w:r>
               <w:rPr>
-                <w:rFonts w:ascii="Calibri" w:hAnsi="Calibri" w:eastAsia="Heiti TC"/>
+                <w:rFonts w:ascii="Calibri" w:hAnsi="Calibri" w:eastAsia="Arial Unicode MS"/>
                 <w:b/>
                 <w:color w:val="111827"/>
                 <w:sz w:val="17"/>
@@ -2275,7 +2275,7 @@
             <w:r/>
             <w:r>
               <w:rPr>
-                <w:rFonts w:ascii="Calibri" w:hAnsi="Calibri" w:eastAsia="Heiti TC"/>
+                <w:rFonts w:ascii="Calibri" w:hAnsi="Calibri" w:eastAsia="Arial Unicode MS"/>
                 <w:b w:val="0"/>
                 <w:color w:val="111827"/>
                 <w:sz w:val="16"/>
@@ -2298,7 +2298,7 @@
             <w:r/>
             <w:r>
               <w:rPr>
-                <w:rFonts w:ascii="Calibri" w:hAnsi="Calibri" w:eastAsia="Heiti TC"/>
+                <w:rFonts w:ascii="Calibri" w:hAnsi="Calibri" w:eastAsia="Arial Unicode MS"/>
                 <w:b w:val="0"/>
                 <w:color w:val="111827"/>
                 <w:sz w:val="17"/>
@@ -2319,7 +2319,7 @@
             <w:r/>
             <w:r>
               <w:rPr>
-                <w:rFonts w:ascii="Calibri" w:hAnsi="Calibri" w:eastAsia="Heiti TC"/>
+                <w:rFonts w:ascii="Calibri" w:hAnsi="Calibri" w:eastAsia="Arial Unicode MS"/>
                 <w:b w:val="0"/>
                 <w:color w:val="111827"/>
                 <w:sz w:val="16"/>
@@ -2340,7 +2340,7 @@
             <w:r/>
             <w:r>
               <w:rPr>
-                <w:rFonts w:ascii="Calibri" w:hAnsi="Calibri" w:eastAsia="Heiti TC"/>
+                <w:rFonts w:ascii="Calibri" w:hAnsi="Calibri" w:eastAsia="Arial Unicode MS"/>
                 <w:b w:val="0"/>
                 <w:color w:val="111827"/>
                 <w:sz w:val="16"/>
@@ -2362,7 +2362,7 @@
             <w:r/>
             <w:r>
               <w:rPr>
-                <w:rFonts w:ascii="Calibri" w:hAnsi="Calibri" w:eastAsia="Heiti TC"/>
+                <w:rFonts w:ascii="Calibri" w:hAnsi="Calibri" w:eastAsia="Arial Unicode MS"/>
                 <w:b/>
                 <w:color w:val="111827"/>
                 <w:sz w:val="17"/>
@@ -2384,7 +2384,7 @@
             <w:r/>
             <w:r>
               <w:rPr>
-                <w:rFonts w:ascii="Calibri" w:hAnsi="Calibri" w:eastAsia="Heiti TC"/>
+                <w:rFonts w:ascii="Calibri" w:hAnsi="Calibri" w:eastAsia="Arial Unicode MS"/>
                 <w:b w:val="0"/>
                 <w:color w:val="111827"/>
                 <w:sz w:val="16"/>
@@ -2407,7 +2407,7 @@
             <w:r/>
             <w:r>
               <w:rPr>
-                <w:rFonts w:ascii="Calibri" w:hAnsi="Calibri" w:eastAsia="Heiti TC"/>
+                <w:rFonts w:ascii="Calibri" w:hAnsi="Calibri" w:eastAsia="Arial Unicode MS"/>
                 <w:b w:val="0"/>
                 <w:color w:val="111827"/>
                 <w:sz w:val="17"/>
@@ -2428,7 +2428,7 @@
             <w:r/>
             <w:r>
               <w:rPr>
-                <w:rFonts w:ascii="Calibri" w:hAnsi="Calibri" w:eastAsia="Heiti TC"/>
+                <w:rFonts w:ascii="Calibri" w:hAnsi="Calibri" w:eastAsia="Arial Unicode MS"/>
                 <w:b w:val="0"/>
                 <w:color w:val="111827"/>
                 <w:sz w:val="16"/>
@@ -2449,7 +2449,7 @@
             <w:r/>
             <w:r>
               <w:rPr>
-                <w:rFonts w:ascii="Calibri" w:hAnsi="Calibri" w:eastAsia="Heiti TC"/>
+                <w:rFonts w:ascii="Calibri" w:hAnsi="Calibri" w:eastAsia="Arial Unicode MS"/>
                 <w:b w:val="0"/>
                 <w:color w:val="111827"/>
                 <w:sz w:val="16"/>
@@ -2471,7 +2471,7 @@
             <w:r/>
             <w:r>
               <w:rPr>
-                <w:rFonts w:ascii="Calibri" w:hAnsi="Calibri" w:eastAsia="Heiti TC"/>
+                <w:rFonts w:ascii="Calibri" w:hAnsi="Calibri" w:eastAsia="Arial Unicode MS"/>
                 <w:b/>
                 <w:color w:val="111827"/>
                 <w:sz w:val="17"/>
@@ -2493,7 +2493,7 @@
             <w:r/>
             <w:r>
               <w:rPr>
-                <w:rFonts w:ascii="Calibri" w:hAnsi="Calibri" w:eastAsia="Heiti TC"/>
+                <w:rFonts w:ascii="Calibri" w:hAnsi="Calibri" w:eastAsia="Arial Unicode MS"/>
                 <w:b w:val="0"/>
                 <w:color w:val="111827"/>
                 <w:sz w:val="16"/>
@@ -2516,7 +2516,7 @@
             <w:r/>
             <w:r>
               <w:rPr>
-                <w:rFonts w:ascii="Calibri" w:hAnsi="Calibri" w:eastAsia="Heiti TC"/>
+                <w:rFonts w:ascii="Calibri" w:hAnsi="Calibri" w:eastAsia="Arial Unicode MS"/>
                 <w:b w:val="0"/>
                 <w:color w:val="111827"/>
                 <w:sz w:val="17"/>
@@ -2537,7 +2537,7 @@
             <w:r/>
             <w:r>
               <w:rPr>
-                <w:rFonts w:ascii="Calibri" w:hAnsi="Calibri" w:eastAsia="Heiti TC"/>
+                <w:rFonts w:ascii="Calibri" w:hAnsi="Calibri" w:eastAsia="Arial Unicode MS"/>
                 <w:b w:val="0"/>
                 <w:color w:val="111827"/>
                 <w:sz w:val="16"/>
@@ -2558,7 +2558,7 @@
             <w:r/>
             <w:r>
               <w:rPr>
-                <w:rFonts w:ascii="Calibri" w:hAnsi="Calibri" w:eastAsia="Heiti TC"/>
+                <w:rFonts w:ascii="Calibri" w:hAnsi="Calibri" w:eastAsia="Arial Unicode MS"/>
                 <w:b w:val="0"/>
                 <w:color w:val="111827"/>
                 <w:sz w:val="16"/>
@@ -2580,7 +2580,7 @@
             <w:r/>
             <w:r>
               <w:rPr>
-                <w:rFonts w:ascii="Calibri" w:hAnsi="Calibri" w:eastAsia="Heiti TC"/>
+                <w:rFonts w:ascii="Calibri" w:hAnsi="Calibri" w:eastAsia="Arial Unicode MS"/>
                 <w:b/>
                 <w:color w:val="111827"/>
                 <w:sz w:val="17"/>
@@ -2602,7 +2602,7 @@
             <w:r/>
             <w:r>
               <w:rPr>
-                <w:rFonts w:ascii="Calibri" w:hAnsi="Calibri" w:eastAsia="Heiti TC"/>
+                <w:rFonts w:ascii="Calibri" w:hAnsi="Calibri" w:eastAsia="Arial Unicode MS"/>
                 <w:b w:val="0"/>
                 <w:color w:val="111827"/>
                 <w:sz w:val="16"/>
@@ -2625,7 +2625,7 @@
             <w:r/>
             <w:r>
               <w:rPr>
-                <w:rFonts w:ascii="Calibri" w:hAnsi="Calibri" w:eastAsia="Heiti TC"/>
+                <w:rFonts w:ascii="Calibri" w:hAnsi="Calibri" w:eastAsia="Arial Unicode MS"/>
                 <w:b w:val="0"/>
                 <w:color w:val="111827"/>
                 <w:sz w:val="17"/>
@@ -2646,7 +2646,7 @@
             <w:r/>
             <w:r>
               <w:rPr>
-                <w:rFonts w:ascii="Calibri" w:hAnsi="Calibri" w:eastAsia="Heiti TC"/>
+                <w:rFonts w:ascii="Calibri" w:hAnsi="Calibri" w:eastAsia="Arial Unicode MS"/>
                 <w:b w:val="0"/>
                 <w:color w:val="111827"/>
                 <w:sz w:val="16"/>
@@ -2667,7 +2667,7 @@
             <w:r/>
             <w:r>
               <w:rPr>
-                <w:rFonts w:ascii="Calibri" w:hAnsi="Calibri" w:eastAsia="Heiti TC"/>
+                <w:rFonts w:ascii="Calibri" w:hAnsi="Calibri" w:eastAsia="Arial Unicode MS"/>
                 <w:b w:val="0"/>
                 <w:color w:val="111827"/>
                 <w:sz w:val="16"/>
@@ -2689,7 +2689,7 @@
             <w:r/>
             <w:r>
               <w:rPr>
-                <w:rFonts w:ascii="Calibri" w:hAnsi="Calibri" w:eastAsia="Heiti TC"/>
+                <w:rFonts w:ascii="Calibri" w:hAnsi="Calibri" w:eastAsia="Arial Unicode MS"/>
                 <w:b/>
                 <w:color w:val="111827"/>
                 <w:sz w:val="17"/>
@@ -2711,7 +2711,7 @@
             <w:r/>
             <w:r>
               <w:rPr>
-                <w:rFonts w:ascii="Calibri" w:hAnsi="Calibri" w:eastAsia="Heiti TC"/>
+                <w:rFonts w:ascii="Calibri" w:hAnsi="Calibri" w:eastAsia="Arial Unicode MS"/>
                 <w:b w:val="0"/>
                 <w:color w:val="111827"/>
                 <w:sz w:val="16"/>
@@ -2734,7 +2734,7 @@
             <w:r/>
             <w:r>
               <w:rPr>
-                <w:rFonts w:ascii="Calibri" w:hAnsi="Calibri" w:eastAsia="Heiti TC"/>
+                <w:rFonts w:ascii="Calibri" w:hAnsi="Calibri" w:eastAsia="Arial Unicode MS"/>
                 <w:b w:val="0"/>
                 <w:color w:val="111827"/>
                 <w:sz w:val="17"/>
@@ -2755,7 +2755,7 @@
             <w:r/>
             <w:r>
               <w:rPr>
-                <w:rFonts w:ascii="Calibri" w:hAnsi="Calibri" w:eastAsia="Heiti TC"/>
+                <w:rFonts w:ascii="Calibri" w:hAnsi="Calibri" w:eastAsia="Arial Unicode MS"/>
                 <w:b w:val="0"/>
                 <w:color w:val="111827"/>
                 <w:sz w:val="16"/>
@@ -2776,7 +2776,7 @@
             <w:r/>
             <w:r>
               <w:rPr>
-                <w:rFonts w:ascii="Calibri" w:hAnsi="Calibri" w:eastAsia="Heiti TC"/>
+                <w:rFonts w:ascii="Calibri" w:hAnsi="Calibri" w:eastAsia="Arial Unicode MS"/>
                 <w:b w:val="0"/>
                 <w:color w:val="111827"/>
                 <w:sz w:val="16"/>
@@ -2798,7 +2798,7 @@
             <w:r/>
             <w:r>
               <w:rPr>
-                <w:rFonts w:ascii="Calibri" w:hAnsi="Calibri" w:eastAsia="Heiti TC"/>
+                <w:rFonts w:ascii="Calibri" w:hAnsi="Calibri" w:eastAsia="Arial Unicode MS"/>
                 <w:b/>
                 <w:color w:val="111827"/>
                 <w:sz w:val="17"/>
@@ -2820,7 +2820,7 @@
             <w:r/>
             <w:r>
               <w:rPr>
-                <w:rFonts w:ascii="Calibri" w:hAnsi="Calibri" w:eastAsia="Heiti TC"/>
+                <w:rFonts w:ascii="Calibri" w:hAnsi="Calibri" w:eastAsia="Arial Unicode MS"/>
                 <w:b w:val="0"/>
                 <w:color w:val="111827"/>
                 <w:sz w:val="16"/>
@@ -2843,7 +2843,7 @@
             <w:r/>
             <w:r>
               <w:rPr>
-                <w:rFonts w:ascii="Calibri" w:hAnsi="Calibri" w:eastAsia="Heiti TC"/>
+                <w:rFonts w:ascii="Calibri" w:hAnsi="Calibri" w:eastAsia="Arial Unicode MS"/>
                 <w:b w:val="0"/>
                 <w:color w:val="111827"/>
                 <w:sz w:val="17"/>
@@ -2864,7 +2864,7 @@
             <w:r/>
             <w:r>
               <w:rPr>
-                <w:rFonts w:ascii="Calibri" w:hAnsi="Calibri" w:eastAsia="Heiti TC"/>
+                <w:rFonts w:ascii="Calibri" w:hAnsi="Calibri" w:eastAsia="Arial Unicode MS"/>
                 <w:b w:val="0"/>
                 <w:color w:val="111827"/>
                 <w:sz w:val="16"/>
@@ -2885,7 +2885,7 @@
             <w:r/>
             <w:r>
               <w:rPr>
-                <w:rFonts w:ascii="Calibri" w:hAnsi="Calibri" w:eastAsia="Heiti TC"/>
+                <w:rFonts w:ascii="Calibri" w:hAnsi="Calibri" w:eastAsia="Arial Unicode MS"/>
                 <w:b w:val="0"/>
                 <w:color w:val="111827"/>
                 <w:sz w:val="16"/>
@@ -2907,7 +2907,7 @@
             <w:r/>
             <w:r>
               <w:rPr>
-                <w:rFonts w:ascii="Calibri" w:hAnsi="Calibri" w:eastAsia="Heiti TC"/>
+                <w:rFonts w:ascii="Calibri" w:hAnsi="Calibri" w:eastAsia="Arial Unicode MS"/>
                 <w:b/>
                 <w:color w:val="111827"/>
                 <w:sz w:val="17"/>
@@ -2929,7 +2929,7 @@
             <w:r/>
             <w:r>
               <w:rPr>
-                <w:rFonts w:ascii="Calibri" w:hAnsi="Calibri" w:eastAsia="Heiti TC"/>
+                <w:rFonts w:ascii="Calibri" w:hAnsi="Calibri" w:eastAsia="Arial Unicode MS"/>
                 <w:b w:val="0"/>
                 <w:color w:val="111827"/>
                 <w:sz w:val="16"/>
@@ -2952,7 +2952,7 @@
             <w:r/>
             <w:r>
               <w:rPr>
-                <w:rFonts w:ascii="Calibri" w:hAnsi="Calibri" w:eastAsia="Heiti TC"/>
+                <w:rFonts w:ascii="Calibri" w:hAnsi="Calibri" w:eastAsia="Arial Unicode MS"/>
                 <w:b w:val="0"/>
                 <w:color w:val="111827"/>
                 <w:sz w:val="17"/>
@@ -2973,7 +2973,7 @@
             <w:r/>
             <w:r>
               <w:rPr>
-                <w:rFonts w:ascii="Calibri" w:hAnsi="Calibri" w:eastAsia="Heiti TC"/>
+                <w:rFonts w:ascii="Calibri" w:hAnsi="Calibri" w:eastAsia="Arial Unicode MS"/>
                 <w:b w:val="0"/>
                 <w:color w:val="111827"/>
                 <w:sz w:val="16"/>
@@ -2994,7 +2994,7 @@
             <w:r/>
             <w:r>
               <w:rPr>
-                <w:rFonts w:ascii="Calibri" w:hAnsi="Calibri" w:eastAsia="Heiti TC"/>
+                <w:rFonts w:ascii="Calibri" w:hAnsi="Calibri" w:eastAsia="Arial Unicode MS"/>
                 <w:b w:val="0"/>
                 <w:color w:val="111827"/>
                 <w:sz w:val="16"/>
@@ -3016,7 +3016,7 @@
             <w:r/>
             <w:r>
               <w:rPr>
-                <w:rFonts w:ascii="Calibri" w:hAnsi="Calibri" w:eastAsia="Heiti TC"/>
+                <w:rFonts w:ascii="Calibri" w:hAnsi="Calibri" w:eastAsia="Arial Unicode MS"/>
                 <w:b/>
                 <w:color w:val="111827"/>
                 <w:sz w:val="17"/>
@@ -3038,7 +3038,7 @@
             <w:r/>
             <w:r>
               <w:rPr>
-                <w:rFonts w:ascii="Calibri" w:hAnsi="Calibri" w:eastAsia="Heiti TC"/>
+                <w:rFonts w:ascii="Calibri" w:hAnsi="Calibri" w:eastAsia="Arial Unicode MS"/>
                 <w:b w:val="0"/>
                 <w:color w:val="111827"/>
                 <w:sz w:val="16"/>
@@ -3061,7 +3061,7 @@
             <w:r/>
             <w:r>
               <w:rPr>
-                <w:rFonts w:ascii="Calibri" w:hAnsi="Calibri" w:eastAsia="Heiti TC"/>
+                <w:rFonts w:ascii="Calibri" w:hAnsi="Calibri" w:eastAsia="Arial Unicode MS"/>
                 <w:b w:val="0"/>
                 <w:color w:val="111827"/>
                 <w:sz w:val="17"/>
@@ -3082,7 +3082,7 @@
             <w:r/>
             <w:r>
               <w:rPr>
-                <w:rFonts w:ascii="Calibri" w:hAnsi="Calibri" w:eastAsia="Heiti TC"/>
+                <w:rFonts w:ascii="Calibri" w:hAnsi="Calibri" w:eastAsia="Arial Unicode MS"/>
                 <w:b w:val="0"/>
                 <w:color w:val="111827"/>
                 <w:sz w:val="16"/>
@@ -3103,7 +3103,7 @@
             <w:r/>
             <w:r>
               <w:rPr>
-                <w:rFonts w:ascii="Calibri" w:hAnsi="Calibri" w:eastAsia="Heiti TC"/>
+                <w:rFonts w:ascii="Calibri" w:hAnsi="Calibri" w:eastAsia="Arial Unicode MS"/>
                 <w:b w:val="0"/>
                 <w:color w:val="111827"/>
                 <w:sz w:val="16"/>
@@ -3125,7 +3125,7 @@
             <w:r/>
             <w:r>
               <w:rPr>
-                <w:rFonts w:ascii="Calibri" w:hAnsi="Calibri" w:eastAsia="Heiti TC"/>
+                <w:rFonts w:ascii="Calibri" w:hAnsi="Calibri" w:eastAsia="Arial Unicode MS"/>
                 <w:b/>
                 <w:color w:val="111827"/>
                 <w:sz w:val="17"/>
@@ -3147,7 +3147,7 @@
             <w:r/>
             <w:r>
               <w:rPr>
-                <w:rFonts w:ascii="Calibri" w:hAnsi="Calibri" w:eastAsia="Heiti TC"/>
+                <w:rFonts w:ascii="Calibri" w:hAnsi="Calibri" w:eastAsia="Arial Unicode MS"/>
                 <w:b w:val="0"/>
                 <w:color w:val="111827"/>
                 <w:sz w:val="16"/>
@@ -3170,7 +3170,7 @@
             <w:r/>
             <w:r>
               <w:rPr>
-                <w:rFonts w:ascii="Calibri" w:hAnsi="Calibri" w:eastAsia="Heiti TC"/>
+                <w:rFonts w:ascii="Calibri" w:hAnsi="Calibri" w:eastAsia="Arial Unicode MS"/>
                 <w:b w:val="0"/>
                 <w:color w:val="111827"/>
                 <w:sz w:val="17"/>
@@ -3191,7 +3191,7 @@
             <w:r/>
             <w:r>
               <w:rPr>
-                <w:rFonts w:ascii="Calibri" w:hAnsi="Calibri" w:eastAsia="Heiti TC"/>
+                <w:rFonts w:ascii="Calibri" w:hAnsi="Calibri" w:eastAsia="Arial Unicode MS"/>
                 <w:b w:val="0"/>
                 <w:color w:val="111827"/>
                 <w:sz w:val="16"/>
@@ -3212,7 +3212,7 @@
             <w:r/>
             <w:r>
               <w:rPr>
-                <w:rFonts w:ascii="Calibri" w:hAnsi="Calibri" w:eastAsia="Heiti TC"/>
+                <w:rFonts w:ascii="Calibri" w:hAnsi="Calibri" w:eastAsia="Arial Unicode MS"/>
                 <w:b w:val="0"/>
                 <w:color w:val="111827"/>
                 <w:sz w:val="16"/>
@@ -3234,7 +3234,7 @@
             <w:r/>
             <w:r>
               <w:rPr>
-                <w:rFonts w:ascii="Calibri" w:hAnsi="Calibri" w:eastAsia="Heiti TC"/>
+                <w:rFonts w:ascii="Calibri" w:hAnsi="Calibri" w:eastAsia="Arial Unicode MS"/>
                 <w:b/>
                 <w:color w:val="111827"/>
                 <w:sz w:val="17"/>
@@ -3256,7 +3256,7 @@
             <w:r/>
             <w:r>
               <w:rPr>
-                <w:rFonts w:ascii="Calibri" w:hAnsi="Calibri" w:eastAsia="Heiti TC"/>
+                <w:rFonts w:ascii="Calibri" w:hAnsi="Calibri" w:eastAsia="Arial Unicode MS"/>
                 <w:b w:val="0"/>
                 <w:color w:val="111827"/>
                 <w:sz w:val="16"/>
@@ -3279,7 +3279,7 @@
             <w:r/>
             <w:r>
               <w:rPr>
-                <w:rFonts w:ascii="Calibri" w:hAnsi="Calibri" w:eastAsia="Heiti TC"/>
+                <w:rFonts w:ascii="Calibri" w:hAnsi="Calibri" w:eastAsia="Arial Unicode MS"/>
                 <w:b w:val="0"/>
                 <w:color w:val="111827"/>
                 <w:sz w:val="17"/>
@@ -3300,7 +3300,7 @@
             <w:r/>
             <w:r>
               <w:rPr>
-                <w:rFonts w:ascii="Calibri" w:hAnsi="Calibri" w:eastAsia="Heiti TC"/>
+                <w:rFonts w:ascii="Calibri" w:hAnsi="Calibri" w:eastAsia="Arial Unicode MS"/>
                 <w:b w:val="0"/>
                 <w:color w:val="111827"/>
                 <w:sz w:val="16"/>
@@ -3321,7 +3321,7 @@
             <w:r/>
             <w:r>
               <w:rPr>
-                <w:rFonts w:ascii="Calibri" w:hAnsi="Calibri" w:eastAsia="Heiti TC"/>
+                <w:rFonts w:ascii="Calibri" w:hAnsi="Calibri" w:eastAsia="Arial Unicode MS"/>
                 <w:b w:val="0"/>
                 <w:color w:val="111827"/>
                 <w:sz w:val="16"/>
@@ -3343,7 +3343,7 @@
             <w:r/>
             <w:r>
               <w:rPr>
-                <w:rFonts w:ascii="Calibri" w:hAnsi="Calibri" w:eastAsia="Heiti TC"/>
+                <w:rFonts w:ascii="Calibri" w:hAnsi="Calibri" w:eastAsia="Arial Unicode MS"/>
                 <w:b/>
                 <w:color w:val="111827"/>
                 <w:sz w:val="17"/>
@@ -3365,7 +3365,7 @@
             <w:r/>
             <w:r>
               <w:rPr>
-                <w:rFonts w:ascii="Calibri" w:hAnsi="Calibri" w:eastAsia="Heiti TC"/>
+                <w:rFonts w:ascii="Calibri" w:hAnsi="Calibri" w:eastAsia="Arial Unicode MS"/>
                 <w:b w:val="0"/>
                 <w:color w:val="111827"/>
                 <w:sz w:val="16"/>
@@ -3382,7 +3382,7 @@
       </w:pPr>
       <w:r>
         <w:rPr>
-          <w:rFonts w:ascii="Calibri" w:hAnsi="Calibri" w:eastAsia="Heiti TC"/>
+          <w:rFonts w:ascii="Calibri" w:hAnsi="Calibri" w:eastAsia="Arial Unicode MS"/>
           <w:b w:val="0"/>
           <w:i/>
           <w:color w:val="667085"/>
@@ -3412,7 +3412,7 @@
     </w:pPr>
     <w:r>
       <w:rPr>
-        <w:rFonts w:ascii="Calibri" w:hAnsi="Calibri" w:eastAsia="Heiti TC"/>
+        <w:rFonts w:ascii="Calibri" w:hAnsi="Calibri" w:eastAsia="Arial Unicode MS"/>
         <w:color w:val="667085"/>
         <w:sz w:val="17"/>
       </w:rPr>
@@ -3431,7 +3431,7 @@
     <w:r/>
     <w:r>
       <w:rPr>
-        <w:rFonts w:ascii="Calibri" w:hAnsi="Calibri" w:eastAsia="Heiti TC"/>
+        <w:rFonts w:ascii="Calibri" w:hAnsi="Calibri" w:eastAsia="Arial Unicode MS"/>
         <w:color w:val="667085"/>
         <w:sz w:val="18"/>
       </w:rPr>
@@ -3808,7 +3808,7 @@
       <w:spacing w:after="120" w:line="264" w:lineRule="auto"/>
     </w:pPr>
     <w:rPr>
-      <w:rFonts w:ascii="Calibri" w:hAnsi="Calibri" w:eastAsia="Heiti TC"/>
+      <w:rFonts w:ascii="Calibri" w:hAnsi="Calibri" w:eastAsia="Arial Unicode MS"/>
       <w:b w:val="0"/>
       <w:color w:val="111827"/>
       <w:sz w:val="22"/>
@@ -3873,7 +3873,7 @@
       <w:outlineLvl w:val="0"/>
     </w:pPr>
     <w:rPr>
-      <w:rFonts w:asciiTheme="majorHAnsi" w:eastAsiaTheme="majorEastAsia" w:hAnsiTheme="majorHAnsi" w:cstheme="majorBidi" w:ascii="Calibri" w:hAnsi="Calibri" w:eastAsia="Heiti TC"/>
+      <w:rFonts w:asciiTheme="majorHAnsi" w:eastAsiaTheme="majorEastAsia" w:hAnsiTheme="majorHAnsi" w:cstheme="majorBidi" w:ascii="Calibri" w:hAnsi="Calibri" w:eastAsia="Arial Unicode MS"/>
       <w:b/>
       <w:bCs/>
       <w:color w:val="2E74B5"/>
@@ -3897,7 +3897,7 @@
       <w:outlineLvl w:val="1"/>
     </w:pPr>
     <w:rPr>
-      <w:rFonts w:asciiTheme="majorHAnsi" w:eastAsiaTheme="majorEastAsia" w:hAnsiTheme="majorHAnsi" w:cstheme="majorBidi" w:ascii="Calibri" w:hAnsi="Calibri" w:eastAsia="Heiti TC"/>
+      <w:rFonts w:asciiTheme="majorHAnsi" w:eastAsiaTheme="majorEastAsia" w:hAnsiTheme="majorHAnsi" w:cstheme="majorBidi" w:ascii="Calibri" w:hAnsi="Calibri" w:eastAsia="Arial Unicode MS"/>
       <w:b/>
       <w:bCs/>
       <w:color w:val="2E74B5"/>
@@ -3921,7 +3921,7 @@
       <w:outlineLvl w:val="2"/>
     </w:pPr>
     <w:rPr>
-      <w:rFonts w:asciiTheme="majorHAnsi" w:eastAsiaTheme="majorEastAsia" w:hAnsiTheme="majorHAnsi" w:cstheme="majorBidi" w:ascii="Calibri" w:hAnsi="Calibri" w:eastAsia="Heiti TC"/>
+      <w:rFonts w:asciiTheme="majorHAnsi" w:eastAsiaTheme="majorEastAsia" w:hAnsiTheme="majorHAnsi" w:cstheme="majorBidi" w:ascii="Calibri" w:hAnsi="Calibri" w:eastAsia="Arial Unicode MS"/>
       <w:b/>
       <w:bCs/>
       <w:color w:val="1F4D78"/>
@@ -4163,7 +4163,7 @@
       <w:contextualSpacing/>
     </w:pPr>
     <w:rPr>
-      <w:rFonts w:asciiTheme="majorHAnsi" w:eastAsiaTheme="majorEastAsia" w:hAnsiTheme="majorHAnsi" w:cstheme="majorBidi" w:ascii="Calibri" w:hAnsi="Calibri" w:eastAsia="Heiti TC"/>
+      <w:rFonts w:asciiTheme="majorHAnsi" w:eastAsiaTheme="majorEastAsia" w:hAnsiTheme="majorHAnsi" w:cstheme="majorBidi" w:ascii="Calibri" w:hAnsi="Calibri" w:eastAsia="Arial Unicode MS"/>
       <w:b/>
       <w:color w:val="0B2545"/>
       <w:spacing w:val="5"/>
@@ -4201,7 +4201,7 @@
       </w:numPr>
     </w:pPr>
     <w:rPr>
-      <w:rFonts w:asciiTheme="majorHAnsi" w:eastAsiaTheme="majorEastAsia" w:hAnsiTheme="majorHAnsi" w:cstheme="majorBidi" w:ascii="Calibri" w:hAnsi="Calibri" w:eastAsia="Heiti TC"/>
+      <w:rFonts w:asciiTheme="majorHAnsi" w:eastAsiaTheme="majorEastAsia" w:hAnsiTheme="majorHAnsi" w:cstheme="majorBidi" w:ascii="Calibri" w:hAnsi="Calibri" w:eastAsia="Arial Unicode MS"/>
       <w:b w:val="0"/>
       <w:i/>
       <w:iCs/>

</xml_diff>